<commit_message>
docs: finalize complete Lab04 WinForms report
</commit_message>
<xml_diff>
--- a/Lab04_WinFormBasic/BaoCao_Lab04_WinFormBasic_NguyenHuynhPhuongDong_3124411071.docx
+++ b/Lab04_WinFormBasic/BaoCao_Lab04_WinFormBasic_NguyenHuynhPhuongDong_3124411071.docx
@@ -94,7 +94,7 @@
           <w:color w:val="1F4E79"/>
           <w:sz w:val="32"/>
         </w:rPr>
-        <w:t>Windows Forms cơ bản phần một</w:t>
+        <w:t>Windows Forms cơ bản</w:t>
       </w:r>
     </w:p>
     <w:tbl>
@@ -238,7 +238,7 @@
     </w:p>
     <w:p>
       <w:r>
-        <w:t>Tài liệu Thực hành 04c có tám đặc tả ứng dụng nếu tính bài mẫu, năm bài tại lớp, một bài nâng cao và một bài về nhà. Báo cáo này trình bày đúng nửa đầu gồm bốn ứng dụng xuất hiện trước tiên. Mỗi Form có giao diện, kiểm tra dữ liệu bằng ErrorProvider hoặc MessageBox, xử lý sự kiện và xác nhận trước khi đóng.</w:t>
+        <w:t>Tài liệu Thực hành 04c có tám đặc tả ứng dụng nếu tính bài mẫu, năm bài tại lớp, một bài nâng cao và một bài về nhà. Báo cáo trình bày đầy đủ cả tám ứng dụng. Các Form có giao diện rõ ràng, kiểm tra dữ liệu, xử lý sự kiện và tách phần nghiệp vụ để kiểm tra tự động.</w:t>
       </w:r>
     </w:p>
     <w:tbl>
@@ -672,7 +672,7 @@
               <w:rPr>
                 <w:sz w:val="20"/>
               </w:rPr>
-              <w:t>Chưa thực hiện</w:t>
+              <w:t>Hoàn thành</w:t>
             </w:r>
           </w:p>
         </w:tc>
@@ -744,7 +744,7 @@
               <w:rPr>
                 <w:sz w:val="20"/>
               </w:rPr>
-              <w:t>Chưa thực hiện</w:t>
+              <w:t>Hoàn thành</w:t>
             </w:r>
           </w:p>
         </w:tc>
@@ -897,7 +897,59 @@
                 <w:color w:val="000000"/>
                 <w:sz w:val="16"/>
               </w:rPr>
-              <w:t xml:space="preserve">  KiemTra/Lab04.SelfTest/     # 10 kiểm tra tự động</w:t>
+              <w:t xml:space="preserve">  Bai04_DaySoVaTinhTong/</w:t>
+            </w:r>
+          </w:p>
+          <w:p>
+            <w:pPr>
+              <w:spacing w:before="0" w:after="0" w:line="240" w:lineRule="auto"/>
+            </w:pPr>
+            <w:r>
+              <w:rPr>
+                <w:rFonts w:ascii="Consolas" w:hAnsi="Consolas" w:eastAsia="Consolas"/>
+                <w:color w:val="000000"/>
+                <w:sz w:val="16"/>
+              </w:rPr>
+              <w:t xml:space="preserve">  Bai05_DocSoThanhChu/</w:t>
+            </w:r>
+          </w:p>
+          <w:p>
+            <w:pPr>
+              <w:spacing w:before="0" w:after="0" w:line="240" w:lineRule="auto"/>
+            </w:pPr>
+            <w:r>
+              <w:rPr>
+                <w:rFonts w:ascii="Consolas" w:hAnsi="Consolas" w:eastAsia="Consolas"/>
+                <w:color w:val="000000"/>
+                <w:sz w:val="16"/>
+              </w:rPr>
+              <w:t xml:space="preserve">  BaiNangCao_BanVeRapPhim/</w:t>
+            </w:r>
+          </w:p>
+          <w:p>
+            <w:pPr>
+              <w:spacing w:before="0" w:after="0" w:line="240" w:lineRule="auto"/>
+            </w:pPr>
+            <w:r>
+              <w:rPr>
+                <w:rFonts w:ascii="Consolas" w:hAnsi="Consolas" w:eastAsia="Consolas"/>
+                <w:color w:val="000000"/>
+                <w:sz w:val="16"/>
+              </w:rPr>
+              <w:t xml:space="preserve">  BaiTapVeNha_MayTinhBoTui/</w:t>
+            </w:r>
+          </w:p>
+          <w:p>
+            <w:pPr>
+              <w:spacing w:before="0" w:after="0" w:line="240" w:lineRule="auto"/>
+            </w:pPr>
+            <w:r>
+              <w:rPr>
+                <w:rFonts w:ascii="Consolas" w:hAnsi="Consolas" w:eastAsia="Consolas"/>
+                <w:color w:val="000000"/>
+                <w:sz w:val="16"/>
+              </w:rPr>
+              <w:t xml:space="preserve">  KiemTra/Lab04.SelfTest/     # 24 kiểm tra tự động</w:t>
             </w:r>
           </w:p>
         </w:tc>
@@ -2773,6 +2825,1550 @@
         <w:spacing w:after="160"/>
       </w:pPr>
       <w:r>
+        <w:t>Bài 4 nhập dãy số và tính tổng</w:t>
+      </w:r>
+    </w:p>
+    <w:p>
+      <w:pPr>
+        <w:keepNext/>
+        <w:jc w:val="center"/>
+      </w:pPr>
+      <w:r>
+        <w:drawing>
+          <wp:inline xmlns:a="http://schemas.openxmlformats.org/drawingml/2006/main" xmlns:pic="http://schemas.openxmlformats.org/drawingml/2006/picture">
+            <wp:extent cx="4608000" cy="2974139"/>
+            <wp:docPr id="6" name="Picture 6"/>
+            <wp:cNvGraphicFramePr>
+              <a:graphicFrameLocks noChangeAspect="1"/>
+            </wp:cNvGraphicFramePr>
+            <a:graphic>
+              <a:graphicData uri="http://schemas.openxmlformats.org/drawingml/2006/picture">
+                <pic:pic>
+                  <pic:nvPicPr>
+                    <pic:cNvPr id="0" name="05-day-so.png"/>
+                    <pic:cNvPicPr/>
+                  </pic:nvPicPr>
+                  <pic:blipFill>
+                    <a:blip r:embed="rId17"/>
+                    <a:stretch>
+                      <a:fillRect/>
+                    </a:stretch>
+                  </pic:blipFill>
+                  <pic:spPr>
+                    <a:xfrm>
+                      <a:off x="0" y="0"/>
+                      <a:ext cx="4608000" cy="2974139"/>
+                    </a:xfrm>
+                    <a:prstGeom prst="rect"/>
+                  </pic:spPr>
+                </pic:pic>
+              </a:graphicData>
+            </a:graphic>
+          </wp:inline>
+        </w:drawing>
+      </w:r>
+    </w:p>
+    <w:p>
+      <w:pPr>
+        <w:spacing w:after="80"/>
+        <w:jc w:val="center"/>
+      </w:pPr>
+      <w:r>
+        <w:rPr>
+          <w:rFonts w:ascii="Times New Roman" w:hAnsi="Times New Roman" w:eastAsia="Times New Roman"/>
+          <w:b w:val="0"/>
+          <w:i/>
+          <w:color w:val="404040"/>
+          <w:sz w:val="20"/>
+        </w:rPr>
+        <w:t>Giao diện nhập dãy và tính tổng toàn bộ, tổng chẵn, tổng lẻ</w:t>
+      </w:r>
+    </w:p>
+    <w:p>
+      <w:pPr>
+        <w:keepNext/>
+        <w:spacing w:before="120" w:after="60"/>
+      </w:pPr>
+      <w:r>
+        <w:rPr>
+          <w:rFonts w:ascii="Times New Roman" w:hAnsi="Times New Roman" w:eastAsia="Times New Roman"/>
+          <w:b/>
+          <w:color w:val="1F4E79"/>
+          <w:sz w:val="22"/>
+        </w:rPr>
+        <w:t>Mã xử lý cốt lõi</w:t>
+      </w:r>
+    </w:p>
+    <w:tbl>
+      <w:tblPr>
+        <w:tblW w:type="auto" w:w="0"/>
+        <w:jc w:val="center"/>
+        <w:tblLayout w:type="fixed"/>
+        <w:tblLook w:firstColumn="1" w:firstRow="1" w:lastColumn="0" w:lastRow="0" w:noHBand="0" w:noVBand="1" w:val="04A0"/>
+      </w:tblPr>
+      <w:tblGrid>
+        <w:gridCol w:w="9298"/>
+      </w:tblGrid>
+      <w:tr>
+        <w:tc>
+          <w:tcPr>
+            <w:tcW w:type="dxa" w:w="9525"/>
+            <w:shd w:fill="F3F6FA"/>
+            <w:tcMar>
+              <w:top w:w="180" w:type="dxa"/>
+              <w:start w:w="240" w:type="dxa"/>
+              <w:bottom w:w="180" w:type="dxa"/>
+              <w:end w:w="240" w:type="dxa"/>
+            </w:tcMar>
+          </w:tcPr>
+          <w:p>
+            <w:pPr>
+              <w:spacing w:before="0" w:after="0" w:line="240" w:lineRule="auto"/>
+            </w:pPr>
+            <w:r>
+              <w:rPr>
+                <w:rFonts w:ascii="Consolas" w:hAnsi="Consolas" w:eastAsia="Consolas"/>
+                <w:color w:val="000000"/>
+                <w:sz w:val="15"/>
+              </w:rPr>
+              <w:t>public bool TryAdd(string text, out string error)</w:t>
+            </w:r>
+          </w:p>
+          <w:p>
+            <w:pPr>
+              <w:spacing w:before="0" w:after="0" w:line="240" w:lineRule="auto"/>
+            </w:pPr>
+            <w:r>
+              <w:rPr>
+                <w:rFonts w:ascii="Consolas" w:hAnsi="Consolas" w:eastAsia="Consolas"/>
+                <w:color w:val="000000"/>
+                <w:sz w:val="15"/>
+              </w:rPr>
+              <w:t xml:space="preserve">    {</w:t>
+            </w:r>
+          </w:p>
+          <w:p>
+            <w:pPr>
+              <w:spacing w:before="0" w:after="0" w:line="240" w:lineRule="auto"/>
+            </w:pPr>
+            <w:r>
+              <w:rPr>
+                <w:rFonts w:ascii="Consolas" w:hAnsi="Consolas" w:eastAsia="Consolas"/>
+                <w:color w:val="000000"/>
+                <w:sz w:val="15"/>
+              </w:rPr>
+              <w:t xml:space="preserve">        if (!int.TryParse(text.Trim(), out int value))</w:t>
+            </w:r>
+          </w:p>
+          <w:p>
+            <w:pPr>
+              <w:spacing w:before="0" w:after="0" w:line="240" w:lineRule="auto"/>
+            </w:pPr>
+            <w:r>
+              <w:rPr>
+                <w:rFonts w:ascii="Consolas" w:hAnsi="Consolas" w:eastAsia="Consolas"/>
+                <w:color w:val="000000"/>
+                <w:sz w:val="15"/>
+              </w:rPr>
+              <w:t xml:space="preserve">        {</w:t>
+            </w:r>
+          </w:p>
+          <w:p>
+            <w:pPr>
+              <w:spacing w:before="0" w:after="0" w:line="240" w:lineRule="auto"/>
+            </w:pPr>
+            <w:r>
+              <w:rPr>
+                <w:rFonts w:ascii="Consolas" w:hAnsi="Consolas" w:eastAsia="Consolas"/>
+                <w:color w:val="000000"/>
+                <w:sz w:val="15"/>
+              </w:rPr>
+              <w:t xml:space="preserve">            error = "Vui lòng nhập một số nguyên hợp lệ.";</w:t>
+            </w:r>
+          </w:p>
+          <w:p>
+            <w:pPr>
+              <w:spacing w:before="0" w:after="0" w:line="240" w:lineRule="auto"/>
+            </w:pPr>
+            <w:r>
+              <w:rPr>
+                <w:rFonts w:ascii="Consolas" w:hAnsi="Consolas" w:eastAsia="Consolas"/>
+                <w:color w:val="000000"/>
+                <w:sz w:val="15"/>
+              </w:rPr>
+              <w:t xml:space="preserve">            return false;</w:t>
+            </w:r>
+          </w:p>
+          <w:p>
+            <w:pPr>
+              <w:spacing w:before="0" w:after="0" w:line="240" w:lineRule="auto"/>
+            </w:pPr>
+            <w:r>
+              <w:rPr>
+                <w:rFonts w:ascii="Consolas" w:hAnsi="Consolas" w:eastAsia="Consolas"/>
+                <w:color w:val="000000"/>
+                <w:sz w:val="15"/>
+              </w:rPr>
+              <w:t xml:space="preserve">        }</w:t>
+            </w:r>
+          </w:p>
+          <w:p>
+            <w:pPr>
+              <w:spacing w:before="0" w:after="0" w:line="240" w:lineRule="auto"/>
+            </w:pPr>
+            <w:r>
+              <w:rPr>
+                <w:rFonts w:ascii="Consolas" w:hAnsi="Consolas" w:eastAsia="Consolas"/>
+                <w:color w:val="000000"/>
+                <w:sz w:val="15"/>
+              </w:rPr>
+              <w:t xml:space="preserve"> </w:t>
+            </w:r>
+          </w:p>
+          <w:p>
+            <w:pPr>
+              <w:spacing w:before="0" w:after="0" w:line="240" w:lineRule="auto"/>
+            </w:pPr>
+            <w:r>
+              <w:rPr>
+                <w:rFonts w:ascii="Consolas" w:hAnsi="Consolas" w:eastAsia="Consolas"/>
+                <w:color w:val="000000"/>
+                <w:sz w:val="15"/>
+              </w:rPr>
+              <w:t xml:space="preserve">        _numbers.Add(value);</w:t>
+            </w:r>
+          </w:p>
+          <w:p>
+            <w:pPr>
+              <w:spacing w:before="0" w:after="0" w:line="240" w:lineRule="auto"/>
+            </w:pPr>
+            <w:r>
+              <w:rPr>
+                <w:rFonts w:ascii="Consolas" w:hAnsi="Consolas" w:eastAsia="Consolas"/>
+                <w:color w:val="000000"/>
+                <w:sz w:val="15"/>
+              </w:rPr>
+              <w:t xml:space="preserve">        error = string.Empty;</w:t>
+            </w:r>
+          </w:p>
+          <w:p>
+            <w:pPr>
+              <w:spacing w:before="0" w:after="0" w:line="240" w:lineRule="auto"/>
+            </w:pPr>
+            <w:r>
+              <w:rPr>
+                <w:rFonts w:ascii="Consolas" w:hAnsi="Consolas" w:eastAsia="Consolas"/>
+                <w:color w:val="000000"/>
+                <w:sz w:val="15"/>
+              </w:rPr>
+              <w:t xml:space="preserve">        return true;</w:t>
+            </w:r>
+          </w:p>
+          <w:p>
+            <w:pPr>
+              <w:spacing w:before="0" w:after="0" w:line="240" w:lineRule="auto"/>
+            </w:pPr>
+            <w:r>
+              <w:rPr>
+                <w:rFonts w:ascii="Consolas" w:hAnsi="Consolas" w:eastAsia="Consolas"/>
+                <w:color w:val="000000"/>
+                <w:sz w:val="15"/>
+              </w:rPr>
+              <w:t xml:space="preserve">    }</w:t>
+            </w:r>
+          </w:p>
+          <w:p>
+            <w:pPr>
+              <w:spacing w:before="0" w:after="0" w:line="240" w:lineRule="auto"/>
+            </w:pPr>
+            <w:r>
+              <w:rPr>
+                <w:rFonts w:ascii="Consolas" w:hAnsi="Consolas" w:eastAsia="Consolas"/>
+                <w:color w:val="000000"/>
+                <w:sz w:val="15"/>
+              </w:rPr>
+              <w:t xml:space="preserve"> </w:t>
+            </w:r>
+          </w:p>
+          <w:p>
+            <w:pPr>
+              <w:spacing w:before="0" w:after="0" w:line="240" w:lineRule="auto"/>
+            </w:pPr>
+            <w:r>
+              <w:rPr>
+                <w:rFonts w:ascii="Consolas" w:hAnsi="Consolas" w:eastAsia="Consolas"/>
+                <w:color w:val="000000"/>
+                <w:sz w:val="15"/>
+              </w:rPr>
+              <w:t xml:space="preserve">    public void Clear() =&gt; _numbers.Clear();</w:t>
+            </w:r>
+          </w:p>
+          <w:p>
+            <w:pPr>
+              <w:spacing w:before="0" w:after="0" w:line="240" w:lineRule="auto"/>
+            </w:pPr>
+            <w:r>
+              <w:rPr>
+                <w:rFonts w:ascii="Consolas" w:hAnsi="Consolas" w:eastAsia="Consolas"/>
+                <w:color w:val="000000"/>
+                <w:sz w:val="15"/>
+              </w:rPr>
+              <w:t>}</w:t>
+            </w:r>
+          </w:p>
+          <w:p>
+            <w:pPr>
+              <w:spacing w:before="0" w:after="0" w:line="240" w:lineRule="auto"/>
+            </w:pPr>
+            <w:r>
+              <w:rPr>
+                <w:rFonts w:ascii="Consolas" w:hAnsi="Consolas" w:eastAsia="Consolas"/>
+                <w:color w:val="000000"/>
+                <w:sz w:val="15"/>
+              </w:rPr>
+              <w:t>// ... Xem đầy đủ trong file mã nguồn.</w:t>
+            </w:r>
+          </w:p>
+        </w:tc>
+      </w:tr>
+    </w:tbl>
+    <w:p>
+      <w:pPr>
+        <w:keepNext/>
+        <w:spacing w:before="120" w:after="60"/>
+      </w:pPr>
+      <w:r>
+        <w:rPr>
+          <w:rFonts w:ascii="Times New Roman" w:hAnsi="Times New Roman" w:eastAsia="Times New Roman"/>
+          <w:b/>
+          <w:color w:val="1F4E79"/>
+          <w:sz w:val="22"/>
+        </w:rPr>
+        <w:t>Giải thích bài làm</w:t>
+      </w:r>
+    </w:p>
+    <w:p>
+      <w:r>
+        <w:t>Mỗi lần nhấn Nhập, chương trình dùng int.TryParse để xác nhận giá trị là số nguyên rồi thêm vào danh sách. Dãy vừa nhập được ghép từ toàn bộ phần tử; Sum tính tổng chung, còn hai biểu thức Where lọc số chẵn và số lẻ trước khi cộng. Ô nhập chặn ký tự sai nhưng vẫn cho phép dấu âm ở đầu. Nút Tiếp tục xóa danh sách, các ô kết quả, lỗi cũ và đưa con trỏ về ô Nhập số.</w:t>
+      </w:r>
+    </w:p>
+    <w:p>
+      <w:pPr>
+        <w:pStyle w:val="Heading1"/>
+        <w:pageBreakBefore/>
+        <w:spacing w:after="160"/>
+      </w:pPr>
+      <w:r>
+        <w:t>Bài 5 đọc số thành chữ</w:t>
+      </w:r>
+    </w:p>
+    <w:p>
+      <w:pPr>
+        <w:keepNext/>
+        <w:jc w:val="center"/>
+      </w:pPr>
+      <w:r>
+        <w:drawing>
+          <wp:inline xmlns:a="http://schemas.openxmlformats.org/drawingml/2006/main" xmlns:pic="http://schemas.openxmlformats.org/drawingml/2006/picture">
+            <wp:extent cx="4608000" cy="2887291"/>
+            <wp:docPr id="7" name="Picture 7"/>
+            <wp:cNvGraphicFramePr>
+              <a:graphicFrameLocks noChangeAspect="1"/>
+            </wp:cNvGraphicFramePr>
+            <a:graphic>
+              <a:graphicData uri="http://schemas.openxmlformats.org/drawingml/2006/picture">
+                <pic:pic>
+                  <pic:nvPicPr>
+                    <pic:cNvPr id="0" name="06-doc-so.png"/>
+                    <pic:cNvPicPr/>
+                  </pic:nvPicPr>
+                  <pic:blipFill>
+                    <a:blip r:embed="rId18"/>
+                    <a:stretch>
+                      <a:fillRect/>
+                    </a:stretch>
+                  </pic:blipFill>
+                  <pic:spPr>
+                    <a:xfrm>
+                      <a:off x="0" y="0"/>
+                      <a:ext cx="4608000" cy="2887291"/>
+                    </a:xfrm>
+                    <a:prstGeom prst="rect"/>
+                  </pic:spPr>
+                </pic:pic>
+              </a:graphicData>
+            </a:graphic>
+          </wp:inline>
+        </w:drawing>
+      </w:r>
+    </w:p>
+    <w:p>
+      <w:pPr>
+        <w:spacing w:after="80"/>
+        <w:jc w:val="center"/>
+      </w:pPr>
+      <w:r>
+        <w:rPr>
+          <w:rFonts w:ascii="Times New Roman" w:hAnsi="Times New Roman" w:eastAsia="Times New Roman"/>
+          <w:b w:val="0"/>
+          <w:i/>
+          <w:color w:val="404040"/>
+          <w:sz w:val="20"/>
+        </w:rPr>
+        <w:t>Giao diện đọc số nguyên từ 1 đến 999 thành chữ tiếng Việt</w:t>
+      </w:r>
+    </w:p>
+    <w:p>
+      <w:pPr>
+        <w:keepNext/>
+        <w:spacing w:before="120" w:after="60"/>
+      </w:pPr>
+      <w:r>
+        <w:rPr>
+          <w:rFonts w:ascii="Times New Roman" w:hAnsi="Times New Roman" w:eastAsia="Times New Roman"/>
+          <w:b/>
+          <w:color w:val="1F4E79"/>
+          <w:sz w:val="22"/>
+        </w:rPr>
+        <w:t>Mã xử lý cốt lõi</w:t>
+      </w:r>
+    </w:p>
+    <w:tbl>
+      <w:tblPr>
+        <w:tblW w:type="auto" w:w="0"/>
+        <w:jc w:val="center"/>
+        <w:tblLayout w:type="fixed"/>
+        <w:tblLook w:firstColumn="1" w:firstRow="1" w:lastColumn="0" w:lastRow="0" w:noHBand="0" w:noVBand="1" w:val="04A0"/>
+      </w:tblPr>
+      <w:tblGrid>
+        <w:gridCol w:w="9298"/>
+      </w:tblGrid>
+      <w:tr>
+        <w:tc>
+          <w:tcPr>
+            <w:tcW w:type="dxa" w:w="9525"/>
+            <w:shd w:fill="F3F6FA"/>
+            <w:tcMar>
+              <w:top w:w="180" w:type="dxa"/>
+              <w:start w:w="240" w:type="dxa"/>
+              <w:bottom w:w="180" w:type="dxa"/>
+              <w:end w:w="240" w:type="dxa"/>
+            </w:tcMar>
+          </w:tcPr>
+          <w:p>
+            <w:pPr>
+              <w:spacing w:before="0" w:after="0" w:line="240" w:lineRule="auto"/>
+            </w:pPr>
+            <w:r>
+              <w:rPr>
+                <w:rFonts w:ascii="Consolas" w:hAnsi="Consolas" w:eastAsia="Consolas"/>
+                <w:color w:val="000000"/>
+                <w:sz w:val="14"/>
+              </w:rPr>
+              <w:t>public static string Read(int number)</w:t>
+            </w:r>
+          </w:p>
+          <w:p>
+            <w:pPr>
+              <w:spacing w:before="0" w:after="0" w:line="240" w:lineRule="auto"/>
+            </w:pPr>
+            <w:r>
+              <w:rPr>
+                <w:rFonts w:ascii="Consolas" w:hAnsi="Consolas" w:eastAsia="Consolas"/>
+                <w:color w:val="000000"/>
+                <w:sz w:val="14"/>
+              </w:rPr>
+              <w:t xml:space="preserve">    {</w:t>
+            </w:r>
+          </w:p>
+          <w:p>
+            <w:pPr>
+              <w:spacing w:before="0" w:after="0" w:line="240" w:lineRule="auto"/>
+            </w:pPr>
+            <w:r>
+              <w:rPr>
+                <w:rFonts w:ascii="Consolas" w:hAnsi="Consolas" w:eastAsia="Consolas"/>
+                <w:color w:val="000000"/>
+                <w:sz w:val="14"/>
+              </w:rPr>
+              <w:t xml:space="preserve">        if (number is &lt; 1 or &gt; 999)</w:t>
+            </w:r>
+          </w:p>
+          <w:p>
+            <w:pPr>
+              <w:spacing w:before="0" w:after="0" w:line="240" w:lineRule="auto"/>
+            </w:pPr>
+            <w:r>
+              <w:rPr>
+                <w:rFonts w:ascii="Consolas" w:hAnsi="Consolas" w:eastAsia="Consolas"/>
+                <w:color w:val="000000"/>
+                <w:sz w:val="14"/>
+              </w:rPr>
+              <w:t xml:space="preserve">            throw new ArgumentOutOfRangeException(nameof(number), "Chỉ đọc số từ 1 đến 999.");</w:t>
+            </w:r>
+          </w:p>
+          <w:p>
+            <w:pPr>
+              <w:spacing w:before="0" w:after="0" w:line="240" w:lineRule="auto"/>
+            </w:pPr>
+            <w:r>
+              <w:rPr>
+                <w:rFonts w:ascii="Consolas" w:hAnsi="Consolas" w:eastAsia="Consolas"/>
+                <w:color w:val="000000"/>
+                <w:sz w:val="14"/>
+              </w:rPr>
+              <w:t xml:space="preserve"> </w:t>
+            </w:r>
+          </w:p>
+          <w:p>
+            <w:pPr>
+              <w:spacing w:before="0" w:after="0" w:line="240" w:lineRule="auto"/>
+            </w:pPr>
+            <w:r>
+              <w:rPr>
+                <w:rFonts w:ascii="Consolas" w:hAnsi="Consolas" w:eastAsia="Consolas"/>
+                <w:color w:val="000000"/>
+                <w:sz w:val="14"/>
+              </w:rPr>
+              <w:t xml:space="preserve">        var parts = new List&lt;string&gt;();</w:t>
+            </w:r>
+          </w:p>
+          <w:p>
+            <w:pPr>
+              <w:spacing w:before="0" w:after="0" w:line="240" w:lineRule="auto"/>
+            </w:pPr>
+            <w:r>
+              <w:rPr>
+                <w:rFonts w:ascii="Consolas" w:hAnsi="Consolas" w:eastAsia="Consolas"/>
+                <w:color w:val="000000"/>
+                <w:sz w:val="14"/>
+              </w:rPr>
+              <w:t xml:space="preserve">        int hundreds = number / 100;</w:t>
+            </w:r>
+          </w:p>
+          <w:p>
+            <w:pPr>
+              <w:spacing w:before="0" w:after="0" w:line="240" w:lineRule="auto"/>
+            </w:pPr>
+            <w:r>
+              <w:rPr>
+                <w:rFonts w:ascii="Consolas" w:hAnsi="Consolas" w:eastAsia="Consolas"/>
+                <w:color w:val="000000"/>
+                <w:sz w:val="14"/>
+              </w:rPr>
+              <w:t xml:space="preserve">        int remainder = number % 100;</w:t>
+            </w:r>
+          </w:p>
+          <w:p>
+            <w:pPr>
+              <w:spacing w:before="0" w:after="0" w:line="240" w:lineRule="auto"/>
+            </w:pPr>
+            <w:r>
+              <w:rPr>
+                <w:rFonts w:ascii="Consolas" w:hAnsi="Consolas" w:eastAsia="Consolas"/>
+                <w:color w:val="000000"/>
+                <w:sz w:val="14"/>
+              </w:rPr>
+              <w:t xml:space="preserve"> </w:t>
+            </w:r>
+          </w:p>
+          <w:p>
+            <w:pPr>
+              <w:spacing w:before="0" w:after="0" w:line="240" w:lineRule="auto"/>
+            </w:pPr>
+            <w:r>
+              <w:rPr>
+                <w:rFonts w:ascii="Consolas" w:hAnsi="Consolas" w:eastAsia="Consolas"/>
+                <w:color w:val="000000"/>
+                <w:sz w:val="14"/>
+              </w:rPr>
+              <w:t xml:space="preserve">        if (hundreds &gt; 0)</w:t>
+            </w:r>
+          </w:p>
+          <w:p>
+            <w:pPr>
+              <w:spacing w:before="0" w:after="0" w:line="240" w:lineRule="auto"/>
+            </w:pPr>
+            <w:r>
+              <w:rPr>
+                <w:rFonts w:ascii="Consolas" w:hAnsi="Consolas" w:eastAsia="Consolas"/>
+                <w:color w:val="000000"/>
+                <w:sz w:val="14"/>
+              </w:rPr>
+              <w:t xml:space="preserve">        {</w:t>
+            </w:r>
+          </w:p>
+          <w:p>
+            <w:pPr>
+              <w:spacing w:before="0" w:after="0" w:line="240" w:lineRule="auto"/>
+            </w:pPr>
+            <w:r>
+              <w:rPr>
+                <w:rFonts w:ascii="Consolas" w:hAnsi="Consolas" w:eastAsia="Consolas"/>
+                <w:color w:val="000000"/>
+                <w:sz w:val="14"/>
+              </w:rPr>
+              <w:t xml:space="preserve">            parts.Add($"{Digits[hundreds]} trăm");</w:t>
+            </w:r>
+          </w:p>
+          <w:p>
+            <w:pPr>
+              <w:spacing w:before="0" w:after="0" w:line="240" w:lineRule="auto"/>
+            </w:pPr>
+            <w:r>
+              <w:rPr>
+                <w:rFonts w:ascii="Consolas" w:hAnsi="Consolas" w:eastAsia="Consolas"/>
+                <w:color w:val="000000"/>
+                <w:sz w:val="14"/>
+              </w:rPr>
+              <w:t xml:space="preserve">            if (remainder is &gt; 0 and &lt; 10) parts.Add("lẻ");</w:t>
+            </w:r>
+          </w:p>
+          <w:p>
+            <w:pPr>
+              <w:spacing w:before="0" w:after="0" w:line="240" w:lineRule="auto"/>
+            </w:pPr>
+            <w:r>
+              <w:rPr>
+                <w:rFonts w:ascii="Consolas" w:hAnsi="Consolas" w:eastAsia="Consolas"/>
+                <w:color w:val="000000"/>
+                <w:sz w:val="14"/>
+              </w:rPr>
+              <w:t xml:space="preserve">        }</w:t>
+            </w:r>
+          </w:p>
+          <w:p>
+            <w:pPr>
+              <w:spacing w:before="0" w:after="0" w:line="240" w:lineRule="auto"/>
+            </w:pPr>
+            <w:r>
+              <w:rPr>
+                <w:rFonts w:ascii="Consolas" w:hAnsi="Consolas" w:eastAsia="Consolas"/>
+                <w:color w:val="000000"/>
+                <w:sz w:val="14"/>
+              </w:rPr>
+              <w:t xml:space="preserve"> </w:t>
+            </w:r>
+          </w:p>
+          <w:p>
+            <w:pPr>
+              <w:spacing w:before="0" w:after="0" w:line="240" w:lineRule="auto"/>
+            </w:pPr>
+            <w:r>
+              <w:rPr>
+                <w:rFonts w:ascii="Consolas" w:hAnsi="Consolas" w:eastAsia="Consolas"/>
+                <w:color w:val="000000"/>
+                <w:sz w:val="14"/>
+              </w:rPr>
+              <w:t xml:space="preserve">        int tens = remainder / 10;</w:t>
+            </w:r>
+          </w:p>
+          <w:p>
+            <w:pPr>
+              <w:spacing w:before="0" w:after="0" w:line="240" w:lineRule="auto"/>
+            </w:pPr>
+            <w:r>
+              <w:rPr>
+                <w:rFonts w:ascii="Consolas" w:hAnsi="Consolas" w:eastAsia="Consolas"/>
+                <w:color w:val="000000"/>
+                <w:sz w:val="14"/>
+              </w:rPr>
+              <w:t xml:space="preserve">        int units = remainder % 10;</w:t>
+            </w:r>
+          </w:p>
+          <w:p>
+            <w:pPr>
+              <w:spacing w:before="0" w:after="0" w:line="240" w:lineRule="auto"/>
+            </w:pPr>
+            <w:r>
+              <w:rPr>
+                <w:rFonts w:ascii="Consolas" w:hAnsi="Consolas" w:eastAsia="Consolas"/>
+                <w:color w:val="000000"/>
+                <w:sz w:val="14"/>
+              </w:rPr>
+              <w:t xml:space="preserve">        if (tens &gt; 1) parts.Add($"{Digits[tens]} mươi");</w:t>
+            </w:r>
+          </w:p>
+          <w:p>
+            <w:pPr>
+              <w:spacing w:before="0" w:after="0" w:line="240" w:lineRule="auto"/>
+            </w:pPr>
+            <w:r>
+              <w:rPr>
+                <w:rFonts w:ascii="Consolas" w:hAnsi="Consolas" w:eastAsia="Consolas"/>
+                <w:color w:val="000000"/>
+                <w:sz w:val="14"/>
+              </w:rPr>
+              <w:t xml:space="preserve">        else if (tens == 1) parts.Add("mười");</w:t>
+            </w:r>
+          </w:p>
+          <w:p>
+            <w:pPr>
+              <w:spacing w:before="0" w:after="0" w:line="240" w:lineRule="auto"/>
+            </w:pPr>
+            <w:r>
+              <w:rPr>
+                <w:rFonts w:ascii="Consolas" w:hAnsi="Consolas" w:eastAsia="Consolas"/>
+                <w:color w:val="000000"/>
+                <w:sz w:val="14"/>
+              </w:rPr>
+              <w:t xml:space="preserve"> </w:t>
+            </w:r>
+          </w:p>
+          <w:p>
+            <w:pPr>
+              <w:spacing w:before="0" w:after="0" w:line="240" w:lineRule="auto"/>
+            </w:pPr>
+            <w:r>
+              <w:rPr>
+                <w:rFonts w:ascii="Consolas" w:hAnsi="Consolas" w:eastAsia="Consolas"/>
+                <w:color w:val="000000"/>
+                <w:sz w:val="14"/>
+              </w:rPr>
+              <w:t xml:space="preserve">        if (units &gt; 0)</w:t>
+            </w:r>
+          </w:p>
+          <w:p>
+            <w:pPr>
+              <w:spacing w:before="0" w:after="0" w:line="240" w:lineRule="auto"/>
+            </w:pPr>
+            <w:r>
+              <w:rPr>
+                <w:rFonts w:ascii="Consolas" w:hAnsi="Consolas" w:eastAsia="Consolas"/>
+                <w:color w:val="000000"/>
+                <w:sz w:val="14"/>
+              </w:rPr>
+              <w:t xml:space="preserve">        {</w:t>
+            </w:r>
+          </w:p>
+          <w:p>
+            <w:pPr>
+              <w:spacing w:before="0" w:after="0" w:line="240" w:lineRule="auto"/>
+            </w:pPr>
+            <w:r>
+              <w:rPr>
+                <w:rFonts w:ascii="Consolas" w:hAnsi="Consolas" w:eastAsia="Consolas"/>
+                <w:color w:val="000000"/>
+                <w:sz w:val="14"/>
+              </w:rPr>
+              <w:t xml:space="preserve">            string unitWord = units switch</w:t>
+            </w:r>
+          </w:p>
+          <w:p>
+            <w:pPr>
+              <w:spacing w:before="0" w:after="0" w:line="240" w:lineRule="auto"/>
+            </w:pPr>
+            <w:r>
+              <w:rPr>
+                <w:rFonts w:ascii="Consolas" w:hAnsi="Consolas" w:eastAsia="Consolas"/>
+                <w:color w:val="000000"/>
+                <w:sz w:val="14"/>
+              </w:rPr>
+              <w:t xml:space="preserve">            {</w:t>
+            </w:r>
+          </w:p>
+          <w:p>
+            <w:pPr>
+              <w:spacing w:before="0" w:after="0" w:line="240" w:lineRule="auto"/>
+            </w:pPr>
+            <w:r>
+              <w:rPr>
+                <w:rFonts w:ascii="Consolas" w:hAnsi="Consolas" w:eastAsia="Consolas"/>
+                <w:color w:val="000000"/>
+                <w:sz w:val="14"/>
+              </w:rPr>
+              <w:t xml:space="preserve">                1 when tens &gt; 1 =&gt; "mốt",</w:t>
+            </w:r>
+          </w:p>
+          <w:p>
+            <w:pPr>
+              <w:spacing w:before="0" w:after="0" w:line="240" w:lineRule="auto"/>
+            </w:pPr>
+            <w:r>
+              <w:rPr>
+                <w:rFonts w:ascii="Consolas" w:hAnsi="Consolas" w:eastAsia="Consolas"/>
+                <w:color w:val="000000"/>
+                <w:sz w:val="14"/>
+              </w:rPr>
+              <w:t xml:space="preserve">                5 when tens &gt; 0 =&gt; "lăm",</w:t>
+            </w:r>
+          </w:p>
+          <w:p>
+            <w:pPr>
+              <w:spacing w:before="0" w:after="0" w:line="240" w:lineRule="auto"/>
+            </w:pPr>
+            <w:r>
+              <w:rPr>
+                <w:rFonts w:ascii="Consolas" w:hAnsi="Consolas" w:eastAsia="Consolas"/>
+                <w:color w:val="000000"/>
+                <w:sz w:val="14"/>
+              </w:rPr>
+              <w:t xml:space="preserve">                _ =&gt; Digits[units]</w:t>
+            </w:r>
+          </w:p>
+          <w:p>
+            <w:pPr>
+              <w:spacing w:before="0" w:after="0" w:line="240" w:lineRule="auto"/>
+            </w:pPr>
+            <w:r>
+              <w:rPr>
+                <w:rFonts w:ascii="Consolas" w:hAnsi="Consolas" w:eastAsia="Consolas"/>
+                <w:color w:val="000000"/>
+                <w:sz w:val="14"/>
+              </w:rPr>
+              <w:t xml:space="preserve">            };</w:t>
+            </w:r>
+          </w:p>
+          <w:p>
+            <w:pPr>
+              <w:spacing w:before="0" w:after="0" w:line="240" w:lineRule="auto"/>
+            </w:pPr>
+            <w:r>
+              <w:rPr>
+                <w:rFonts w:ascii="Consolas" w:hAnsi="Consolas" w:eastAsia="Consolas"/>
+                <w:color w:val="000000"/>
+                <w:sz w:val="14"/>
+              </w:rPr>
+              <w:t xml:space="preserve">            parts.Add(unitWord);</w:t>
+            </w:r>
+          </w:p>
+          <w:p>
+            <w:pPr>
+              <w:spacing w:before="0" w:after="0" w:line="240" w:lineRule="auto"/>
+            </w:pPr>
+            <w:r>
+              <w:rPr>
+                <w:rFonts w:ascii="Consolas" w:hAnsi="Consolas" w:eastAsia="Consolas"/>
+                <w:color w:val="000000"/>
+                <w:sz w:val="14"/>
+              </w:rPr>
+              <w:t xml:space="preserve">        }</w:t>
+            </w:r>
+          </w:p>
+          <w:p>
+            <w:pPr>
+              <w:spacing w:before="0" w:after="0" w:line="240" w:lineRule="auto"/>
+            </w:pPr>
+            <w:r>
+              <w:rPr>
+                <w:rFonts w:ascii="Consolas" w:hAnsi="Consolas" w:eastAsia="Consolas"/>
+                <w:color w:val="000000"/>
+                <w:sz w:val="14"/>
+              </w:rPr>
+              <w:t xml:space="preserve"> </w:t>
+            </w:r>
+          </w:p>
+          <w:p>
+            <w:pPr>
+              <w:spacing w:before="0" w:after="0" w:line="240" w:lineRule="auto"/>
+            </w:pPr>
+            <w:r>
+              <w:rPr>
+                <w:rFonts w:ascii="Consolas" w:hAnsi="Consolas" w:eastAsia="Consolas"/>
+                <w:color w:val="000000"/>
+                <w:sz w:val="14"/>
+              </w:rPr>
+              <w:t xml:space="preserve">        return string.Join(" ", parts);</w:t>
+            </w:r>
+          </w:p>
+          <w:p>
+            <w:pPr>
+              <w:spacing w:before="0" w:after="0" w:line="240" w:lineRule="auto"/>
+            </w:pPr>
+            <w:r>
+              <w:rPr>
+                <w:rFonts w:ascii="Consolas" w:hAnsi="Consolas" w:eastAsia="Consolas"/>
+                <w:color w:val="000000"/>
+                <w:sz w:val="14"/>
+              </w:rPr>
+              <w:t xml:space="preserve">    }</w:t>
+            </w:r>
+          </w:p>
+          <w:p>
+            <w:pPr>
+              <w:spacing w:before="0" w:after="0" w:line="240" w:lineRule="auto"/>
+            </w:pPr>
+            <w:r>
+              <w:rPr>
+                <w:rFonts w:ascii="Consolas" w:hAnsi="Consolas" w:eastAsia="Consolas"/>
+                <w:color w:val="000000"/>
+                <w:sz w:val="14"/>
+              </w:rPr>
+              <w:t>}</w:t>
+            </w:r>
+          </w:p>
+          <w:p>
+            <w:pPr>
+              <w:spacing w:before="0" w:after="0" w:line="240" w:lineRule="auto"/>
+            </w:pPr>
+            <w:r>
+              <w:rPr>
+                <w:rFonts w:ascii="Consolas" w:hAnsi="Consolas" w:eastAsia="Consolas"/>
+                <w:color w:val="000000"/>
+                <w:sz w:val="14"/>
+              </w:rPr>
+              <w:t>// ... Xem đầy đủ trong file mã nguồn.</w:t>
+            </w:r>
+          </w:p>
+        </w:tc>
+      </w:tr>
+    </w:tbl>
+    <w:p>
+      <w:pPr>
+        <w:keepNext/>
+        <w:spacing w:before="120" w:after="60"/>
+      </w:pPr>
+      <w:r>
+        <w:rPr>
+          <w:rFonts w:ascii="Times New Roman" w:hAnsi="Times New Roman" w:eastAsia="Times New Roman"/>
+          <w:b/>
+          <w:color w:val="1F4E79"/>
+          <w:sz w:val="22"/>
+        </w:rPr>
+        <w:t>Giải thích bài làm</w:t>
+      </w:r>
+    </w:p>
+    <w:p>
+      <w:r>
+        <w:t>Chương trình chỉ nhận số nguyên trong đoạn 1 đến 999. Số được tách thành hàng trăm, hàng chục và hàng đơn vị. Quy tắc tiếng Việt được xử lý riêng cho các trường hợp lẻ, mười, mốt và lăm; ví dụ 105 đọc là một trăm lẻ năm, còn 231 đọc là hai trăm ba mươi mốt. Kết quả được viết hoa chữ cái đầu. Nút Xóa trả Form về trạng thái ban đầu và nút Thoát yêu cầu xác nhận.</w:t>
+      </w:r>
+    </w:p>
+    <w:p>
+      <w:pPr>
+        <w:pStyle w:val="Heading1"/>
+        <w:pageBreakBefore/>
+        <w:spacing w:after="160"/>
+      </w:pPr>
+      <w:r>
+        <w:t>Bài nâng cao bán vé rạp phim</w:t>
+      </w:r>
+    </w:p>
+    <w:p>
+      <w:pPr>
+        <w:keepNext/>
+        <w:jc w:val="center"/>
+      </w:pPr>
+      <w:r>
+        <w:drawing>
+          <wp:inline xmlns:a="http://schemas.openxmlformats.org/drawingml/2006/main" xmlns:pic="http://schemas.openxmlformats.org/drawingml/2006/picture">
+            <wp:extent cx="4608000" cy="4710075"/>
+            <wp:docPr id="8" name="Picture 8"/>
+            <wp:cNvGraphicFramePr>
+              <a:graphicFrameLocks noChangeAspect="1"/>
+            </wp:cNvGraphicFramePr>
+            <a:graphic>
+              <a:graphicData uri="http://schemas.openxmlformats.org/drawingml/2006/picture">
+                <pic:pic>
+                  <pic:nvPicPr>
+                    <pic:cNvPr id="0" name="07-ban-ve.png"/>
+                    <pic:cNvPicPr/>
+                  </pic:nvPicPr>
+                  <pic:blipFill>
+                    <a:blip r:embed="rId19"/>
+                    <a:stretch>
+                      <a:fillRect/>
+                    </a:stretch>
+                  </pic:blipFill>
+                  <pic:spPr>
+                    <a:xfrm>
+                      <a:off x="0" y="0"/>
+                      <a:ext cx="4608000" cy="4710075"/>
+                    </a:xfrm>
+                    <a:prstGeom prst="rect"/>
+                  </pic:spPr>
+                </pic:pic>
+              </a:graphicData>
+            </a:graphic>
+          </wp:inline>
+        </w:drawing>
+      </w:r>
+    </w:p>
+    <w:p>
+      <w:pPr>
+        <w:spacing w:after="80"/>
+        <w:jc w:val="center"/>
+      </w:pPr>
+      <w:r>
+        <w:rPr>
+          <w:rFonts w:ascii="Times New Roman" w:hAnsi="Times New Roman" w:eastAsia="Times New Roman"/>
+          <w:b w:val="0"/>
+          <w:i/>
+          <w:color w:val="404040"/>
+          <w:sz w:val="20"/>
+        </w:rPr>
+        <w:t>Sơ đồ 15 ghế, chia thành ba lô giá vé</w:t>
+      </w:r>
+    </w:p>
+    <w:p>
+      <w:pPr>
+        <w:keepNext/>
+        <w:spacing w:before="120" w:after="60"/>
+      </w:pPr>
+      <w:r>
+        <w:rPr>
+          <w:rFonts w:ascii="Times New Roman" w:hAnsi="Times New Roman" w:eastAsia="Times New Roman"/>
+          <w:b/>
+          <w:color w:val="1F4E79"/>
+          <w:sz w:val="22"/>
+        </w:rPr>
+        <w:t>Mã xử lý cốt lõi</w:t>
+      </w:r>
+    </w:p>
+    <w:tbl>
+      <w:tblPr>
+        <w:tblW w:type="auto" w:w="0"/>
+        <w:jc w:val="center"/>
+        <w:tblLayout w:type="fixed"/>
+        <w:tblLook w:firstColumn="1" w:firstRow="1" w:lastColumn="0" w:lastRow="0" w:noHBand="0" w:noVBand="1" w:val="04A0"/>
+      </w:tblPr>
+      <w:tblGrid>
+        <w:gridCol w:w="9298"/>
+      </w:tblGrid>
+      <w:tr>
+        <w:tc>
+          <w:tcPr>
+            <w:tcW w:type="dxa" w:w="9525"/>
+            <w:shd w:fill="F3F6FA"/>
+            <w:tcMar>
+              <w:top w:w="180" w:type="dxa"/>
+              <w:start w:w="240" w:type="dxa"/>
+              <w:bottom w:w="180" w:type="dxa"/>
+              <w:end w:w="240" w:type="dxa"/>
+            </w:tcMar>
+          </w:tcPr>
+          <w:p>
+            <w:pPr>
+              <w:spacing w:before="0" w:after="0" w:line="240" w:lineRule="auto"/>
+            </w:pPr>
+            <w:r>
+              <w:rPr>
+                <w:rFonts w:ascii="Consolas" w:hAnsi="Consolas" w:eastAsia="Consolas"/>
+                <w:color w:val="000000"/>
+                <w:sz w:val="14"/>
+              </w:rPr>
+              <w:t>public bool ToggleSelection(int seatNumber, out string message)</w:t>
+            </w:r>
+          </w:p>
+          <w:p>
+            <w:pPr>
+              <w:spacing w:before="0" w:after="0" w:line="240" w:lineRule="auto"/>
+            </w:pPr>
+            <w:r>
+              <w:rPr>
+                <w:rFonts w:ascii="Consolas" w:hAnsi="Consolas" w:eastAsia="Consolas"/>
+                <w:color w:val="000000"/>
+                <w:sz w:val="14"/>
+              </w:rPr>
+              <w:t>{</w:t>
+            </w:r>
+          </w:p>
+          <w:p>
+            <w:pPr>
+              <w:spacing w:before="0" w:after="0" w:line="240" w:lineRule="auto"/>
+            </w:pPr>
+            <w:r>
+              <w:rPr>
+                <w:rFonts w:ascii="Consolas" w:hAnsi="Consolas" w:eastAsia="Consolas"/>
+                <w:color w:val="000000"/>
+                <w:sz w:val="14"/>
+              </w:rPr>
+              <w:t xml:space="preserve">    int index = ToIndex(seatNumber);</w:t>
+            </w:r>
+          </w:p>
+          <w:p>
+            <w:pPr>
+              <w:spacing w:before="0" w:after="0" w:line="240" w:lineRule="auto"/>
+            </w:pPr>
+            <w:r>
+              <w:rPr>
+                <w:rFonts w:ascii="Consolas" w:hAnsi="Consolas" w:eastAsia="Consolas"/>
+                <w:color w:val="000000"/>
+                <w:sz w:val="14"/>
+              </w:rPr>
+              <w:t xml:space="preserve">    if (_seats[index] == SeatState.Sold)</w:t>
+            </w:r>
+          </w:p>
+          <w:p>
+            <w:pPr>
+              <w:spacing w:before="0" w:after="0" w:line="240" w:lineRule="auto"/>
+            </w:pPr>
+            <w:r>
+              <w:rPr>
+                <w:rFonts w:ascii="Consolas" w:hAnsi="Consolas" w:eastAsia="Consolas"/>
+                <w:color w:val="000000"/>
+                <w:sz w:val="14"/>
+              </w:rPr>
+              <w:t xml:space="preserve">    {</w:t>
+            </w:r>
+          </w:p>
+          <w:p>
+            <w:pPr>
+              <w:spacing w:before="0" w:after="0" w:line="240" w:lineRule="auto"/>
+            </w:pPr>
+            <w:r>
+              <w:rPr>
+                <w:rFonts w:ascii="Consolas" w:hAnsi="Consolas" w:eastAsia="Consolas"/>
+                <w:color w:val="000000"/>
+                <w:sz w:val="14"/>
+              </w:rPr>
+              <w:t xml:space="preserve">        message = $"Ghế {seatNumber} đã được bán.";</w:t>
+            </w:r>
+          </w:p>
+          <w:p>
+            <w:pPr>
+              <w:spacing w:before="0" w:after="0" w:line="240" w:lineRule="auto"/>
+            </w:pPr>
+            <w:r>
+              <w:rPr>
+                <w:rFonts w:ascii="Consolas" w:hAnsi="Consolas" w:eastAsia="Consolas"/>
+                <w:color w:val="000000"/>
+                <w:sz w:val="14"/>
+              </w:rPr>
+              <w:t xml:space="preserve">        return false;</w:t>
+            </w:r>
+          </w:p>
+          <w:p>
+            <w:pPr>
+              <w:spacing w:before="0" w:after="0" w:line="240" w:lineRule="auto"/>
+            </w:pPr>
+            <w:r>
+              <w:rPr>
+                <w:rFonts w:ascii="Consolas" w:hAnsi="Consolas" w:eastAsia="Consolas"/>
+                <w:color w:val="000000"/>
+                <w:sz w:val="14"/>
+              </w:rPr>
+              <w:t xml:space="preserve">    }</w:t>
+            </w:r>
+          </w:p>
+          <w:p>
+            <w:pPr>
+              <w:spacing w:before="0" w:after="0" w:line="240" w:lineRule="auto"/>
+            </w:pPr>
+            <w:r>
+              <w:rPr>
+                <w:rFonts w:ascii="Consolas" w:hAnsi="Consolas" w:eastAsia="Consolas"/>
+                <w:color w:val="000000"/>
+                <w:sz w:val="14"/>
+              </w:rPr>
+              <w:t xml:space="preserve"> </w:t>
+            </w:r>
+          </w:p>
+          <w:p>
+            <w:pPr>
+              <w:spacing w:before="0" w:after="0" w:line="240" w:lineRule="auto"/>
+            </w:pPr>
+            <w:r>
+              <w:rPr>
+                <w:rFonts w:ascii="Consolas" w:hAnsi="Consolas" w:eastAsia="Consolas"/>
+                <w:color w:val="000000"/>
+                <w:sz w:val="14"/>
+              </w:rPr>
+              <w:t xml:space="preserve">    _seats[index] = _seats[index] == SeatState.Available</w:t>
+            </w:r>
+          </w:p>
+          <w:p>
+            <w:pPr>
+              <w:spacing w:before="0" w:after="0" w:line="240" w:lineRule="auto"/>
+            </w:pPr>
+            <w:r>
+              <w:rPr>
+                <w:rFonts w:ascii="Consolas" w:hAnsi="Consolas" w:eastAsia="Consolas"/>
+                <w:color w:val="000000"/>
+                <w:sz w:val="14"/>
+              </w:rPr>
+              <w:t xml:space="preserve">        ? SeatState.Selected</w:t>
+            </w:r>
+          </w:p>
+          <w:p>
+            <w:pPr>
+              <w:spacing w:before="0" w:after="0" w:line="240" w:lineRule="auto"/>
+            </w:pPr>
+            <w:r>
+              <w:rPr>
+                <w:rFonts w:ascii="Consolas" w:hAnsi="Consolas" w:eastAsia="Consolas"/>
+                <w:color w:val="000000"/>
+                <w:sz w:val="14"/>
+              </w:rPr>
+              <w:t xml:space="preserve">        : SeatState.Available;</w:t>
+            </w:r>
+          </w:p>
+          <w:p>
+            <w:pPr>
+              <w:spacing w:before="0" w:after="0" w:line="240" w:lineRule="auto"/>
+            </w:pPr>
+            <w:r>
+              <w:rPr>
+                <w:rFonts w:ascii="Consolas" w:hAnsi="Consolas" w:eastAsia="Consolas"/>
+                <w:color w:val="000000"/>
+                <w:sz w:val="14"/>
+              </w:rPr>
+              <w:t xml:space="preserve">    message = string.Empty;</w:t>
+            </w:r>
+          </w:p>
+          <w:p>
+            <w:pPr>
+              <w:spacing w:before="0" w:after="0" w:line="240" w:lineRule="auto"/>
+            </w:pPr>
+            <w:r>
+              <w:rPr>
+                <w:rFonts w:ascii="Consolas" w:hAnsi="Consolas" w:eastAsia="Consolas"/>
+                <w:color w:val="000000"/>
+                <w:sz w:val="14"/>
+              </w:rPr>
+              <w:t xml:space="preserve">    return true;</w:t>
+            </w:r>
+          </w:p>
+          <w:p>
+            <w:pPr>
+              <w:spacing w:before="0" w:after="0" w:line="240" w:lineRule="auto"/>
+            </w:pPr>
+            <w:r>
+              <w:rPr>
+                <w:rFonts w:ascii="Consolas" w:hAnsi="Consolas" w:eastAsia="Consolas"/>
+                <w:color w:val="000000"/>
+                <w:sz w:val="14"/>
+              </w:rPr>
+              <w:t>}</w:t>
+            </w:r>
+          </w:p>
+          <w:p>
+            <w:pPr>
+              <w:spacing w:before="0" w:after="0" w:line="240" w:lineRule="auto"/>
+            </w:pPr>
+            <w:r>
+              <w:rPr>
+                <w:rFonts w:ascii="Consolas" w:hAnsi="Consolas" w:eastAsia="Consolas"/>
+                <w:color w:val="000000"/>
+                <w:sz w:val="14"/>
+              </w:rPr>
+              <w:t xml:space="preserve"> </w:t>
+            </w:r>
+          </w:p>
+          <w:p>
+            <w:pPr>
+              <w:spacing w:before="0" w:after="0" w:line="240" w:lineRule="auto"/>
+            </w:pPr>
+            <w:r>
+              <w:rPr>
+                <w:rFonts w:ascii="Consolas" w:hAnsi="Consolas" w:eastAsia="Consolas"/>
+                <w:color w:val="000000"/>
+                <w:sz w:val="14"/>
+              </w:rPr>
+              <w:t>public int ConfirmSelection()</w:t>
+            </w:r>
+          </w:p>
+          <w:p>
+            <w:pPr>
+              <w:spacing w:before="0" w:after="0" w:line="240" w:lineRule="auto"/>
+            </w:pPr>
+            <w:r>
+              <w:rPr>
+                <w:rFonts w:ascii="Consolas" w:hAnsi="Consolas" w:eastAsia="Consolas"/>
+                <w:color w:val="000000"/>
+                <w:sz w:val="14"/>
+              </w:rPr>
+              <w:t>{</w:t>
+            </w:r>
+          </w:p>
+          <w:p>
+            <w:pPr>
+              <w:spacing w:before="0" w:after="0" w:line="240" w:lineRule="auto"/>
+            </w:pPr>
+            <w:r>
+              <w:rPr>
+                <w:rFonts w:ascii="Consolas" w:hAnsi="Consolas" w:eastAsia="Consolas"/>
+                <w:color w:val="000000"/>
+                <w:sz w:val="14"/>
+              </w:rPr>
+              <w:t>// ... Xem đầy đủ trong file mã nguồn.</w:t>
+            </w:r>
+          </w:p>
+        </w:tc>
+      </w:tr>
+    </w:tbl>
+    <w:p>
+      <w:pPr>
+        <w:keepNext/>
+        <w:spacing w:before="120" w:after="60"/>
+      </w:pPr>
+      <w:r>
+        <w:rPr>
+          <w:rFonts w:ascii="Times New Roman" w:hAnsi="Times New Roman" w:eastAsia="Times New Roman"/>
+          <w:b/>
+          <w:color w:val="1F4E79"/>
+          <w:sz w:val="22"/>
+        </w:rPr>
+        <w:t>Giải thích bài làm</w:t>
+      </w:r>
+    </w:p>
+    <w:p>
+      <w:r>
+        <w:t>Mười lăm ghế có ba trạng thái: trắng là còn trống, xanh là đang chọn và vàng là đã bán. Khi bấm ghế trống hoặc ghế đang chọn, ToggleSelection đổi qua lại hai trạng thái; ghế đã bán bị khóa và có MessageBox thông báo. Nút Chọn tính tiền theo lô A, B, C lần lượt là 1.000, 1.500 và 2.000 đồng rồi chuyển toàn bộ ghế xanh thành vàng. Nút Hủy bỏ trả ghế xanh về trắng và đưa thành tiền về 0.</w:t>
+      </w:r>
+    </w:p>
+    <w:p>
+      <w:pPr>
+        <w:pStyle w:val="Heading1"/>
+        <w:pageBreakBefore/>
+        <w:spacing w:after="160"/>
+      </w:pPr>
+      <w:r>
+        <w:t>Bài về nhà máy tính bỏ túi</w:t>
+      </w:r>
+    </w:p>
+    <w:p>
+      <w:pPr>
+        <w:keepNext/>
+        <w:jc w:val="center"/>
+      </w:pPr>
+      <w:r>
+        <w:drawing>
+          <wp:inline xmlns:a="http://schemas.openxmlformats.org/drawingml/2006/main" xmlns:pic="http://schemas.openxmlformats.org/drawingml/2006/picture">
+            <wp:extent cx="3888000" cy="5474149"/>
+            <wp:docPr id="9" name="Picture 9"/>
+            <wp:cNvGraphicFramePr>
+              <a:graphicFrameLocks noChangeAspect="1"/>
+            </wp:cNvGraphicFramePr>
+            <a:graphic>
+              <a:graphicData uri="http://schemas.openxmlformats.org/drawingml/2006/picture">
+                <pic:pic>
+                  <pic:nvPicPr>
+                    <pic:cNvPr id="0" name="08-may-tinh.png"/>
+                    <pic:cNvPicPr/>
+                  </pic:nvPicPr>
+                  <pic:blipFill>
+                    <a:blip r:embed="rId20"/>
+                    <a:stretch>
+                      <a:fillRect/>
+                    </a:stretch>
+                  </pic:blipFill>
+                  <pic:spPr>
+                    <a:xfrm>
+                      <a:off x="0" y="0"/>
+                      <a:ext cx="3888000" cy="5474149"/>
+                    </a:xfrm>
+                    <a:prstGeom prst="rect"/>
+                  </pic:spPr>
+                </pic:pic>
+              </a:graphicData>
+            </a:graphic>
+          </wp:inline>
+        </w:drawing>
+      </w:r>
+    </w:p>
+    <w:p>
+      <w:pPr>
+        <w:spacing w:after="80"/>
+        <w:jc w:val="center"/>
+      </w:pPr>
+      <w:r>
+        <w:rPr>
+          <w:rFonts w:ascii="Times New Roman" w:hAnsi="Times New Roman" w:eastAsia="Times New Roman"/>
+          <w:b w:val="0"/>
+          <w:i/>
+          <w:color w:val="404040"/>
+          <w:sz w:val="20"/>
+        </w:rPr>
+        <w:t>Giao diện máy tính cộng, trừ, nhân, chia và xóa</w:t>
+      </w:r>
+    </w:p>
+    <w:p>
+      <w:pPr>
+        <w:keepNext/>
+        <w:spacing w:before="120" w:after="60"/>
+      </w:pPr>
+      <w:r>
+        <w:rPr>
+          <w:rFonts w:ascii="Times New Roman" w:hAnsi="Times New Roman" w:eastAsia="Times New Roman"/>
+          <w:b/>
+          <w:color w:val="1F4E79"/>
+          <w:sz w:val="22"/>
+        </w:rPr>
+        <w:t>Mã xử lý cốt lõi</w:t>
+      </w:r>
+    </w:p>
+    <w:tbl>
+      <w:tblPr>
+        <w:tblW w:type="auto" w:w="0"/>
+        <w:jc w:val="center"/>
+        <w:tblLayout w:type="fixed"/>
+        <w:tblLook w:firstColumn="1" w:firstRow="1" w:lastColumn="0" w:lastRow="0" w:noHBand="0" w:noVBand="1" w:val="04A0"/>
+      </w:tblPr>
+      <w:tblGrid>
+        <w:gridCol w:w="9298"/>
+      </w:tblGrid>
+      <w:tr>
+        <w:tc>
+          <w:tcPr>
+            <w:tcW w:type="dxa" w:w="9525"/>
+            <w:shd w:fill="F3F6FA"/>
+            <w:tcMar>
+              <w:top w:w="180" w:type="dxa"/>
+              <w:start w:w="240" w:type="dxa"/>
+              <w:bottom w:w="180" w:type="dxa"/>
+              <w:end w:w="240" w:type="dxa"/>
+            </w:tcMar>
+          </w:tcPr>
+          <w:p>
+            <w:pPr>
+              <w:spacing w:before="0" w:after="0" w:line="240" w:lineRule="auto"/>
+            </w:pPr>
+            <w:r>
+              <w:rPr>
+                <w:rFonts w:ascii="Consolas" w:hAnsi="Consolas" w:eastAsia="Consolas"/>
+                <w:color w:val="000000"/>
+                <w:sz w:val="14"/>
+              </w:rPr>
+              <w:t>public bool TryEvaluate(out string error)</w:t>
+            </w:r>
+          </w:p>
+          <w:p>
+            <w:pPr>
+              <w:spacing w:before="0" w:after="0" w:line="240" w:lineRule="auto"/>
+            </w:pPr>
+            <w:r>
+              <w:rPr>
+                <w:rFonts w:ascii="Consolas" w:hAnsi="Consolas" w:eastAsia="Consolas"/>
+                <w:color w:val="000000"/>
+                <w:sz w:val="14"/>
+              </w:rPr>
+              <w:t>{</w:t>
+            </w:r>
+          </w:p>
+          <w:p>
+            <w:pPr>
+              <w:spacing w:before="0" w:after="0" w:line="240" w:lineRule="auto"/>
+            </w:pPr>
+            <w:r>
+              <w:rPr>
+                <w:rFonts w:ascii="Consolas" w:hAnsi="Consolas" w:eastAsia="Consolas"/>
+                <w:color w:val="000000"/>
+                <w:sz w:val="14"/>
+              </w:rPr>
+              <w:t xml:space="preserve">    if (_leftOperand is null || _operation is null)</w:t>
+            </w:r>
+          </w:p>
+          <w:p>
+            <w:pPr>
+              <w:spacing w:before="0" w:after="0" w:line="240" w:lineRule="auto"/>
+            </w:pPr>
+            <w:r>
+              <w:rPr>
+                <w:rFonts w:ascii="Consolas" w:hAnsi="Consolas" w:eastAsia="Consolas"/>
+                <w:color w:val="000000"/>
+                <w:sz w:val="14"/>
+              </w:rPr>
+              <w:t xml:space="preserve">    {</w:t>
+            </w:r>
+          </w:p>
+          <w:p>
+            <w:pPr>
+              <w:spacing w:before="0" w:after="0" w:line="240" w:lineRule="auto"/>
+            </w:pPr>
+            <w:r>
+              <w:rPr>
+                <w:rFonts w:ascii="Consolas" w:hAnsi="Consolas" w:eastAsia="Consolas"/>
+                <w:color w:val="000000"/>
+                <w:sz w:val="14"/>
+              </w:rPr>
+              <w:t xml:space="preserve">        error = "Hãy chọn phép toán trước khi tính kết quả.";</w:t>
+            </w:r>
+          </w:p>
+          <w:p>
+            <w:pPr>
+              <w:spacing w:before="0" w:after="0" w:line="240" w:lineRule="auto"/>
+            </w:pPr>
+            <w:r>
+              <w:rPr>
+                <w:rFonts w:ascii="Consolas" w:hAnsi="Consolas" w:eastAsia="Consolas"/>
+                <w:color w:val="000000"/>
+                <w:sz w:val="14"/>
+              </w:rPr>
+              <w:t xml:space="preserve">        return false;</w:t>
+            </w:r>
+          </w:p>
+          <w:p>
+            <w:pPr>
+              <w:spacing w:before="0" w:after="0" w:line="240" w:lineRule="auto"/>
+            </w:pPr>
+            <w:r>
+              <w:rPr>
+                <w:rFonts w:ascii="Consolas" w:hAnsi="Consolas" w:eastAsia="Consolas"/>
+                <w:color w:val="000000"/>
+                <w:sz w:val="14"/>
+              </w:rPr>
+              <w:t xml:space="preserve">    }</w:t>
+            </w:r>
+          </w:p>
+          <w:p>
+            <w:pPr>
+              <w:spacing w:before="0" w:after="0" w:line="240" w:lineRule="auto"/>
+            </w:pPr>
+            <w:r>
+              <w:rPr>
+                <w:rFonts w:ascii="Consolas" w:hAnsi="Consolas" w:eastAsia="Consolas"/>
+                <w:color w:val="000000"/>
+                <w:sz w:val="14"/>
+              </w:rPr>
+              <w:t xml:space="preserve"> </w:t>
+            </w:r>
+          </w:p>
+          <w:p>
+            <w:pPr>
+              <w:spacing w:before="0" w:after="0" w:line="240" w:lineRule="auto"/>
+            </w:pPr>
+            <w:r>
+              <w:rPr>
+                <w:rFonts w:ascii="Consolas" w:hAnsi="Consolas" w:eastAsia="Consolas"/>
+                <w:color w:val="000000"/>
+                <w:sz w:val="14"/>
+              </w:rPr>
+              <w:t xml:space="preserve">    decimal right = decimal.Parse(Display, CultureInfo.InvariantCulture);</w:t>
+            </w:r>
+          </w:p>
+          <w:p>
+            <w:pPr>
+              <w:spacing w:before="0" w:after="0" w:line="240" w:lineRule="auto"/>
+            </w:pPr>
+            <w:r>
+              <w:rPr>
+                <w:rFonts w:ascii="Consolas" w:hAnsi="Consolas" w:eastAsia="Consolas"/>
+                <w:color w:val="000000"/>
+                <w:sz w:val="14"/>
+              </w:rPr>
+              <w:t>// ... Xem đầy đủ trong file mã nguồn.</w:t>
+            </w:r>
+          </w:p>
+        </w:tc>
+      </w:tr>
+    </w:tbl>
+    <w:p>
+      <w:pPr>
+        <w:keepNext/>
+        <w:spacing w:before="120" w:after="60"/>
+      </w:pPr>
+      <w:r>
+        <w:rPr>
+          <w:rFonts w:ascii="Times New Roman" w:hAnsi="Times New Roman" w:eastAsia="Times New Roman"/>
+          <w:b/>
+          <w:color w:val="1F4E79"/>
+          <w:sz w:val="22"/>
+        </w:rPr>
+        <w:t>Giải thích bài làm</w:t>
+      </w:r>
+    </w:p>
+    <w:p>
+      <w:r>
+        <w:t>Các nút số ghép chữ số vào màn hình. Khi chọn phép toán, máy tính lưu toán hạng thứ nhất và chờ số tiếp theo. Nút bằng thực hiện phép cộng, trừ, nhân hoặc chia; riêng chia cho 0 được chặn và báo lỗi. Kết quả giữ tối đa mười chữ số thập phân cần thiết. Nút C xóa màn hình, toán hạng và phép toán đang chờ để bắt đầu phép tính mới.</w:t>
+      </w:r>
+    </w:p>
+    <w:p>
+      <w:pPr>
+        <w:pStyle w:val="Heading1"/>
+        <w:pageBreakBefore/>
+        <w:spacing w:after="160"/>
+      </w:pPr>
+      <w:r>
         <w:t>Kết quả kiểm tra và kết luận</w:t>
       </w:r>
     </w:p>
@@ -2836,7 +4432,7 @@
                 <w:color w:val="000000"/>
                 <w:sz w:val="16"/>
               </w:rPr>
-              <w:t>KIỂM TRA THÀNH CÔNG: 10/10 điều kiện đạt.</w:t>
+              <w:t>KIỂM TRA THÀNH CÔNG: 24/24 điều kiện đạt.</w:t>
             </w:r>
           </w:p>
         </w:tc>
@@ -3110,6 +4706,206 @@
           </w:p>
         </w:tc>
       </w:tr>
+      <w:tr>
+        <w:trPr>
+          <w:cantSplit/>
+        </w:trPr>
+        <w:tc>
+          <w:tcPr>
+            <w:tcW w:type="dxa" w:w="4762"/>
+            <w:shd w:fill="EAF2F8"/>
+            <w:tcMar>
+              <w:top w:w="150" w:type="dxa"/>
+              <w:start w:w="190" w:type="dxa"/>
+              <w:bottom w:w="150" w:type="dxa"/>
+              <w:end w:w="190" w:type="dxa"/>
+            </w:tcMar>
+          </w:tcPr>
+          <w:p>
+            <w:pPr>
+              <w:spacing w:after="0"/>
+            </w:pPr>
+            <w:r>
+              <w:rPr>
+                <w:sz w:val="20"/>
+              </w:rPr>
+              <w:t>Dãy số</w:t>
+            </w:r>
+          </w:p>
+        </w:tc>
+        <w:tc>
+          <w:tcPr>
+            <w:tcW w:type="dxa" w:w="4762"/>
+            <w:shd w:fill="EAF2F8"/>
+            <w:tcMar>
+              <w:top w:w="150" w:type="dxa"/>
+              <w:start w:w="190" w:type="dxa"/>
+              <w:bottom w:w="150" w:type="dxa"/>
+              <w:end w:w="190" w:type="dxa"/>
+            </w:tcMar>
+          </w:tcPr>
+          <w:p>
+            <w:pPr>
+              <w:spacing w:after="0"/>
+            </w:pPr>
+            <w:r>
+              <w:rPr>
+                <w:sz w:val="20"/>
+              </w:rPr>
+              <w:t>Tính đúng tổng chung, tổng chẵn và tổng lẻ; từ chối số thực</w:t>
+            </w:r>
+          </w:p>
+        </w:tc>
+      </w:tr>
+      <w:tr>
+        <w:trPr>
+          <w:cantSplit/>
+        </w:trPr>
+        <w:tc>
+          <w:tcPr>
+            <w:tcW w:type="dxa" w:w="4762"/>
+            <w:tcMar>
+              <w:top w:w="150" w:type="dxa"/>
+              <w:start w:w="190" w:type="dxa"/>
+              <w:bottom w:w="150" w:type="dxa"/>
+              <w:end w:w="190" w:type="dxa"/>
+            </w:tcMar>
+          </w:tcPr>
+          <w:p>
+            <w:pPr>
+              <w:spacing w:after="0"/>
+            </w:pPr>
+            <w:r>
+              <w:rPr>
+                <w:sz w:val="20"/>
+              </w:rPr>
+              <w:t>Đọc số</w:t>
+            </w:r>
+          </w:p>
+        </w:tc>
+        <w:tc>
+          <w:tcPr>
+            <w:tcW w:type="dxa" w:w="4762"/>
+            <w:tcMar>
+              <w:top w:w="150" w:type="dxa"/>
+              <w:start w:w="190" w:type="dxa"/>
+              <w:bottom w:w="150" w:type="dxa"/>
+              <w:end w:w="190" w:type="dxa"/>
+            </w:tcMar>
+          </w:tcPr>
+          <w:p>
+            <w:pPr>
+              <w:spacing w:after="0"/>
+            </w:pPr>
+            <w:r>
+              <w:rPr>
+                <w:sz w:val="20"/>
+              </w:rPr>
+              <w:t>Đọc đúng 1, 105, 231; chặn số ngoài đoạn 1-999</w:t>
+            </w:r>
+          </w:p>
+        </w:tc>
+      </w:tr>
+      <w:tr>
+        <w:trPr>
+          <w:cantSplit/>
+        </w:trPr>
+        <w:tc>
+          <w:tcPr>
+            <w:tcW w:type="dxa" w:w="4762"/>
+            <w:shd w:fill="EAF2F8"/>
+            <w:tcMar>
+              <w:top w:w="150" w:type="dxa"/>
+              <w:start w:w="190" w:type="dxa"/>
+              <w:bottom w:w="150" w:type="dxa"/>
+              <w:end w:w="190" w:type="dxa"/>
+            </w:tcMar>
+          </w:tcPr>
+          <w:p>
+            <w:pPr>
+              <w:spacing w:after="0"/>
+            </w:pPr>
+            <w:r>
+              <w:rPr>
+                <w:sz w:val="20"/>
+              </w:rPr>
+              <w:t>Bán vé</w:t>
+            </w:r>
+          </w:p>
+        </w:tc>
+        <w:tc>
+          <w:tcPr>
+            <w:tcW w:type="dxa" w:w="4762"/>
+            <w:shd w:fill="EAF2F8"/>
+            <w:tcMar>
+              <w:top w:w="150" w:type="dxa"/>
+              <w:start w:w="190" w:type="dxa"/>
+              <w:bottom w:w="150" w:type="dxa"/>
+              <w:end w:w="190" w:type="dxa"/>
+            </w:tcMar>
+          </w:tcPr>
+          <w:p>
+            <w:pPr>
+              <w:spacing w:after="0"/>
+            </w:pPr>
+            <w:r>
+              <w:rPr>
+                <w:sz w:val="20"/>
+              </w:rPr>
+              <w:t>Tính đúng giá theo lô, khóa ghế đã bán và hủy lựa chọn</w:t>
+            </w:r>
+          </w:p>
+        </w:tc>
+      </w:tr>
+      <w:tr>
+        <w:trPr>
+          <w:cantSplit/>
+        </w:trPr>
+        <w:tc>
+          <w:tcPr>
+            <w:tcW w:type="dxa" w:w="4762"/>
+            <w:tcMar>
+              <w:top w:w="150" w:type="dxa"/>
+              <w:start w:w="190" w:type="dxa"/>
+              <w:bottom w:w="150" w:type="dxa"/>
+              <w:end w:w="190" w:type="dxa"/>
+            </w:tcMar>
+          </w:tcPr>
+          <w:p>
+            <w:pPr>
+              <w:spacing w:after="0"/>
+            </w:pPr>
+            <w:r>
+              <w:rPr>
+                <w:sz w:val="20"/>
+              </w:rPr>
+              <w:t>Máy tính</w:t>
+            </w:r>
+          </w:p>
+        </w:tc>
+        <w:tc>
+          <w:tcPr>
+            <w:tcW w:type="dxa" w:w="4762"/>
+            <w:tcMar>
+              <w:top w:w="150" w:type="dxa"/>
+              <w:start w:w="190" w:type="dxa"/>
+              <w:bottom w:w="150" w:type="dxa"/>
+              <w:end w:w="190" w:type="dxa"/>
+            </w:tcMar>
+          </w:tcPr>
+          <w:p>
+            <w:pPr>
+              <w:spacing w:after="0"/>
+            </w:pPr>
+            <w:r>
+              <w:rPr>
+                <w:sz w:val="20"/>
+              </w:rPr>
+              <w:t>8 / 2 = 4; chặn phép chia cho 0</w:t>
+            </w:r>
+          </w:p>
+        </w:tc>
+      </w:tr>
     </w:tbl>
     <w:p>
       <w:pPr>
@@ -3128,7 +4924,7 @@
     </w:p>
     <w:p>
       <w:r>
-        <w:t>Nửa đầu Lab04 đã hoàn thành bốn ứng dụng WinForms đúng thứ tự của tài liệu. Bài làm sử dụng TextBox, Label, Button, ErrorProvider, MessageBox, AcceptButton, CancelButton và FormClosing; phần nghiệp vụ được tách khỏi giao diện để kiểm tra tự động. Bốn phần còn lại chưa được triển khai trong giai đoạn này.</w:t>
+        <w:t>Lab04 đã hoàn thành đầy đủ tám ứng dụng WinForms theo tài liệu. Bài làm sử dụng TextBox, Label, Button, ErrorProvider, MessageBox, AcceptButton, CancelButton và FormClosing; phần nghiệp vụ được tách khỏi giao diện để kiểm tra tự động. Các chương trình xử lý đầy đủ tình huống nhập sai, chia cho 0, ghế đã bán và thao tác xóa hoặc hủy.</w:t>
       </w:r>
     </w:p>
     <w:sectPr>

</xml_diff>